<commit_message>
báo cáo kết luận
</commit_message>
<xml_diff>
--- a/File docs/Báo cáo dự án .docx
+++ b/File docs/Báo cáo dự án .docx
@@ -9455,6 +9455,869 @@
         </w:rPr>
       </w:pPr>
     </w:p>
+    <w:p>
+      <w:pPr>
+        <w:pStyle w:val="Heading1"/>
+        <w:ind w:left="567"/>
+        <w:rPr>
+          <w:bCs/>
+        </w:rPr>
+      </w:pPr>
+      <w:r>
+        <w:t xml:space="preserve">CHƯƠNG </w:t>
+      </w:r>
+      <w:r>
+        <w:t>5</w:t>
+      </w:r>
+      <w:r>
+        <w:t xml:space="preserve">: </w:t>
+      </w:r>
+      <w:r>
+        <w:rPr>
+          <w:bCs/>
+        </w:rPr>
+        <w:t>KẾT LUẬN VÀ ĐỀ XUẤT</w:t>
+      </w:r>
+    </w:p>
+    <w:p>
+      <w:pPr>
+        <w:pStyle w:val="Heading2"/>
+        <w:ind w:left="567"/>
+        <w:rPr>
+          <w:bCs/>
+        </w:rPr>
+      </w:pPr>
+      <w:r>
+        <w:t>5</w:t>
+      </w:r>
+      <w:r>
+        <w:t xml:space="preserve">.1 </w:t>
+      </w:r>
+      <w:r>
+        <w:rPr>
+          <w:bCs/>
+        </w:rPr>
+        <w:t>Kết luận chung</w:t>
+      </w:r>
+    </w:p>
+    <w:p>
+      <w:pPr>
+        <w:jc w:val="both"/>
+        <w:rPr>
+          <w:rFonts w:ascii="Times New Roman" w:hAnsi="Times New Roman" w:cs="Times New Roman"/>
+          <w:sz w:val="24"/>
+          <w:szCs w:val="24"/>
+        </w:rPr>
+      </w:pPr>
+      <w:r>
+        <w:rPr>
+          <w:rFonts w:ascii="Times New Roman" w:hAnsi="Times New Roman" w:cs="Times New Roman"/>
+          <w:sz w:val="24"/>
+          <w:szCs w:val="24"/>
+        </w:rPr>
+        <w:t>Thông qua quá trình thu thập, làm sạch, chuẩn hóa, mô hình hóa và phân tích bộ dữ liệu Global Superstore, nhóm đã xây dựng được một quy trình phân tích dữ liệu kinh doanh nhằm đánh giá toàn diện hiệu quả hoạt động của chuỗi bán lẻ trên các khía cạnh chính gồm doanh thu, lợi nhuận, sản phẩm, khách hàng, thị trường và logistics.</w:t>
+      </w:r>
+    </w:p>
+    <w:p>
+      <w:pPr>
+        <w:jc w:val="both"/>
+        <w:rPr>
+          <w:rFonts w:ascii="Times New Roman" w:hAnsi="Times New Roman" w:cs="Times New Roman"/>
+          <w:sz w:val="24"/>
+          <w:szCs w:val="24"/>
+        </w:rPr>
+      </w:pPr>
+      <w:r>
+        <w:rPr>
+          <w:rFonts w:ascii="Times New Roman" w:hAnsi="Times New Roman" w:cs="Times New Roman"/>
+          <w:sz w:val="24"/>
+          <w:szCs w:val="24"/>
+        </w:rPr>
+        <w:t>Kết quả phân tích cho thấy Superstore đạt khoảng 13 triệu USD doanh thu và 1,5 triệu USD lợi nhuận, tương ứng biên lợi nhuận khoảng 11,6%. Mặc dù hoạt động kinh doanh nhìn chung tạo ra lợi nhuận, dữ liệu cho thấy doanh nghiệp vẫn tồn tại một vấn đề đáng chú ý: doanh thu cao nhưng hiệu quả sinh lời chưa tương xứng. Khoảng 24,5% đơn hàng đang chịu lỗ, tức gần một phần tư tổng số đơn hàng. Tình trạng này xuất hiện đáng kể tại các thị trường EMEA, APAC và LATAM.</w:t>
+      </w:r>
+    </w:p>
+    <w:p>
+      <w:pPr>
+        <w:jc w:val="both"/>
+        <w:rPr>
+          <w:rFonts w:ascii="Times New Roman" w:hAnsi="Times New Roman" w:cs="Times New Roman"/>
+          <w:sz w:val="24"/>
+          <w:szCs w:val="24"/>
+        </w:rPr>
+      </w:pPr>
+      <w:r>
+        <w:rPr>
+          <w:rFonts w:ascii="Times New Roman" w:hAnsi="Times New Roman" w:cs="Times New Roman"/>
+          <w:sz w:val="24"/>
+          <w:szCs w:val="24"/>
+        </w:rPr>
+        <w:t>Như vậy, bài toán quan trọng đối với doanh nghiệp không chỉ là tiếp tục gia tăng doanh số mà còn phải kiểm soát chất lượng của doanh thu, tức xác định doanh thu nào thực sự tạo ra lợi nhuận và doanh thu nào đang đi kèm với chi phí hoặc mức giảm giá quá lớn.</w:t>
+      </w:r>
+    </w:p>
+    <w:p>
+      <w:pPr>
+        <w:pStyle w:val="Heading2"/>
+        <w:ind w:left="567"/>
+        <w:rPr>
+          <w:bCs/>
+        </w:rPr>
+      </w:pPr>
+      <w:r>
+        <w:t>5</w:t>
+      </w:r>
+      <w:r>
+        <w:t xml:space="preserve">.2 </w:t>
+      </w:r>
+      <w:r>
+        <w:rPr>
+          <w:bCs/>
+        </w:rPr>
+        <w:t>Các vấn đề trọng tâm được phát hiện</w:t>
+      </w:r>
+    </w:p>
+    <w:p>
+      <w:pPr>
+        <w:pStyle w:val="Heading3"/>
+        <w:ind w:left="567"/>
+      </w:pPr>
+      <w:r>
+        <w:t>5.</w:t>
+      </w:r>
+      <w:r>
+        <w:t>2.1</w:t>
+      </w:r>
+      <w:r>
+        <w:t xml:space="preserve"> Chiết khấu là một trong những yếu tố ảnh hưởng lớn đến lợi nhuận</w:t>
+      </w:r>
+    </w:p>
+    <w:p>
+      <w:pPr>
+        <w:jc w:val="both"/>
+        <w:rPr>
+          <w:rFonts w:ascii="Times New Roman" w:hAnsi="Times New Roman" w:cs="Times New Roman"/>
+          <w:sz w:val="24"/>
+          <w:szCs w:val="24"/>
+        </w:rPr>
+      </w:pPr>
+      <w:r>
+        <w:rPr>
+          <w:rFonts w:ascii="Times New Roman" w:hAnsi="Times New Roman" w:cs="Times New Roman"/>
+          <w:sz w:val="24"/>
+          <w:szCs w:val="24"/>
+        </w:rPr>
+        <w:t>Kết quả phân tích cho thấy các đơn hàng có mức chiết khấu từ 0% đến 30% vẫn tạo ra mức lợi nhuận tích cực. Tuy nhiên, khi mức chiết khấu vượt 30%, hiệu quả kinh doanh suy giảm mạnh và nhóm giao dịch này ghi nhận tổng lợi nhuận âm khoảng 793 nghìn USD.</w:t>
+      </w:r>
+    </w:p>
+    <w:p>
+      <w:pPr>
+        <w:jc w:val="both"/>
+        <w:rPr>
+          <w:rFonts w:ascii="Times New Roman" w:hAnsi="Times New Roman" w:cs="Times New Roman"/>
+          <w:sz w:val="24"/>
+          <w:szCs w:val="24"/>
+        </w:rPr>
+      </w:pPr>
+      <w:r>
+        <w:rPr>
+          <w:rFonts w:ascii="Times New Roman" w:hAnsi="Times New Roman" w:cs="Times New Roman"/>
+          <w:sz w:val="24"/>
+          <w:szCs w:val="24"/>
+        </w:rPr>
+        <w:t>Điều này cho thấy chính sách giảm giá nếu không được kiểm soát có thể tạo ra hiện tượng tăng doanh số nhưng không tạo ra giá trị lợi nhuận tương ứng. Do đó, doanh nghiệp cần xem xét mức chiết khấu không chỉ dựa trên khả năng kích cầu mà còn dựa trên biên lợi nhuận thực tế của từng sản phẩm và từng thị trường.</w:t>
+      </w:r>
+    </w:p>
+    <w:p>
+      <w:pPr>
+        <w:jc w:val="both"/>
+        <w:rPr>
+          <w:rFonts w:ascii="Times New Roman" w:hAnsi="Times New Roman" w:cs="Times New Roman"/>
+          <w:sz w:val="24"/>
+          <w:szCs w:val="24"/>
+        </w:rPr>
+      </w:pPr>
+    </w:p>
+    <w:p>
+      <w:pPr>
+        <w:jc w:val="both"/>
+        <w:rPr>
+          <w:rFonts w:ascii="Times New Roman" w:hAnsi="Times New Roman" w:cs="Times New Roman"/>
+          <w:sz w:val="24"/>
+          <w:szCs w:val="24"/>
+        </w:rPr>
+      </w:pPr>
+    </w:p>
+    <w:p>
+      <w:pPr>
+        <w:pStyle w:val="Heading3"/>
+        <w:ind w:left="567"/>
+      </w:pPr>
+      <w:r>
+        <w:lastRenderedPageBreak/>
+        <w:t>5.2.</w:t>
+      </w:r>
+      <w:r>
+        <w:t>2</w:t>
+      </w:r>
+      <w:r>
+        <w:t xml:space="preserve"> Hiệu quả giữa các nhóm sản phẩm có sự chênh lệch lớn</w:t>
+      </w:r>
+    </w:p>
+    <w:p/>
+    <w:p>
+      <w:pPr>
+        <w:rPr>
+          <w:rFonts w:ascii="Times New Roman" w:hAnsi="Times New Roman" w:cs="Times New Roman"/>
+          <w:sz w:val="24"/>
+          <w:szCs w:val="24"/>
+        </w:rPr>
+      </w:pPr>
+      <w:r>
+        <w:rPr>
+          <w:rFonts w:ascii="Times New Roman" w:hAnsi="Times New Roman" w:cs="Times New Roman"/>
+          <w:sz w:val="24"/>
+          <w:szCs w:val="24"/>
+        </w:rPr>
+        <w:t>Phân tích theo Category và Sub-Category cho thấy không phải sản phẩm có doanh số cao đều mang lại hiệu quả kinh doanh tốt.</w:t>
+      </w:r>
+    </w:p>
+    <w:p>
+      <w:pPr>
+        <w:rPr>
+          <w:rFonts w:ascii="Times New Roman" w:hAnsi="Times New Roman" w:cs="Times New Roman"/>
+          <w:sz w:val="24"/>
+          <w:szCs w:val="24"/>
+        </w:rPr>
+      </w:pPr>
+      <w:r>
+        <w:rPr>
+          <w:rFonts w:ascii="Times New Roman" w:hAnsi="Times New Roman" w:cs="Times New Roman"/>
+          <w:sz w:val="24"/>
+          <w:szCs w:val="24"/>
+        </w:rPr>
+        <w:t>Trong đó, nhóm Technology, đặc biệt là Copiers, cho thấy khả năng tạo lợi nhuận tốt và đóng vai trò quan trọng trong cơ cấu lợi nhuận. Ngược lại, Tables là một trong những nhóm sản phẩm có hiệu quả thấp và chịu mức lỗ đáng kể, qua đó ảnh hưởng tiêu cực đến hiệu quả chung của ngành hàng Furniture.</w:t>
+      </w:r>
+    </w:p>
+    <w:p>
+      <w:pPr>
+        <w:rPr>
+          <w:rFonts w:ascii="Times New Roman" w:hAnsi="Times New Roman" w:cs="Times New Roman"/>
+          <w:sz w:val="24"/>
+          <w:szCs w:val="24"/>
+        </w:rPr>
+      </w:pPr>
+      <w:r>
+        <w:rPr>
+          <w:rFonts w:ascii="Times New Roman" w:hAnsi="Times New Roman" w:cs="Times New Roman"/>
+          <w:sz w:val="24"/>
+          <w:szCs w:val="24"/>
+        </w:rPr>
+        <w:t>Kết quả này cho thấy doanh nghiệp cần chuyển từ chiến lược đánh giá sản phẩm dựa chủ yếu vào doanh số sang đánh giá đồng thời Sales – Profit – Profit Margin – Discount, từ đó xác định chính xác những sản phẩm thực sự tạo ra giá trị.</w:t>
+      </w:r>
+    </w:p>
+    <w:p>
+      <w:pPr>
+        <w:pStyle w:val="Heading3"/>
+        <w:ind w:left="567"/>
+      </w:pPr>
+      <w:r>
+        <w:t>5.2.</w:t>
+      </w:r>
+      <w:r>
+        <w:t>3</w:t>
+      </w:r>
+      <w:r>
+        <w:t xml:space="preserve"> Rủi ro mất nhóm khách hàng có giá trị cao</w:t>
+      </w:r>
+    </w:p>
+    <w:p>
+      <w:pPr>
+        <w:jc w:val="both"/>
+        <w:rPr>
+          <w:rFonts w:ascii="Times New Roman" w:hAnsi="Times New Roman" w:cs="Times New Roman"/>
+          <w:sz w:val="24"/>
+          <w:szCs w:val="24"/>
+        </w:rPr>
+      </w:pPr>
+      <w:r>
+        <w:rPr>
+          <w:rFonts w:ascii="Times New Roman" w:hAnsi="Times New Roman" w:cs="Times New Roman"/>
+          <w:sz w:val="24"/>
+          <w:szCs w:val="24"/>
+        </w:rPr>
+        <w:t>Thông qua phân tích RFM, nhóm xác định được nhiều phân khúc khách hàng có đặc điểm và giá trị khác nhau.</w:t>
+      </w:r>
+    </w:p>
+    <w:p>
+      <w:pPr>
+        <w:jc w:val="both"/>
+        <w:rPr>
+          <w:rFonts w:ascii="Times New Roman" w:hAnsi="Times New Roman" w:cs="Times New Roman"/>
+          <w:sz w:val="24"/>
+          <w:szCs w:val="24"/>
+        </w:rPr>
+      </w:pPr>
+      <w:r>
+        <w:rPr>
+          <w:rFonts w:ascii="Times New Roman" w:hAnsi="Times New Roman" w:cs="Times New Roman"/>
+          <w:sz w:val="24"/>
+          <w:szCs w:val="24"/>
+        </w:rPr>
+        <w:t>Nhóm Champions gồm 422 khách hàng đang đóng góp khoảng 227 nghìn USD doanh thu, thể hiện đây là nhóm khách hàng có giá trị cao đối với doanh nghiệp.</w:t>
+      </w:r>
+    </w:p>
+    <w:p>
+      <w:pPr>
+        <w:jc w:val="both"/>
+        <w:rPr>
+          <w:rFonts w:ascii="Times New Roman" w:hAnsi="Times New Roman" w:cs="Times New Roman"/>
+          <w:sz w:val="24"/>
+          <w:szCs w:val="24"/>
+        </w:rPr>
+      </w:pPr>
+      <w:r>
+        <w:rPr>
+          <w:rFonts w:ascii="Times New Roman" w:hAnsi="Times New Roman" w:cs="Times New Roman"/>
+          <w:sz w:val="24"/>
+          <w:szCs w:val="24"/>
+        </w:rPr>
+        <w:t>Tuy nhiên, kết quả cũng phát hiện 394 khách hàng thuộc nhóm “Can't Lose Them” và 531 khách hàng thuộc nhóm “Churn High Spending” có dấu hiệu rủi ro. Tổng doanh thu liên quan đến hai nhóm này vượt 201 nghìn USD.</w:t>
+      </w:r>
+    </w:p>
+    <w:p>
+      <w:pPr>
+        <w:jc w:val="both"/>
+        <w:rPr>
+          <w:rFonts w:ascii="Times New Roman" w:hAnsi="Times New Roman" w:cs="Times New Roman"/>
+          <w:sz w:val="24"/>
+          <w:szCs w:val="24"/>
+        </w:rPr>
+      </w:pPr>
+      <w:r>
+        <w:rPr>
+          <w:rFonts w:ascii="Times New Roman" w:hAnsi="Times New Roman" w:cs="Times New Roman"/>
+          <w:sz w:val="24"/>
+          <w:szCs w:val="24"/>
+        </w:rPr>
+        <w:t>Điều này cho thấy bên cạnh mục tiêu thu hút khách hàng mới, doanh nghiệp cần quan tâm đến việc duy trì và tái kích hoạt các khách hàng có giá trị cao, bởi việc mất những khách hàng này có thể ảnh hưởng đáng kể đến doanh thu trong tương lai.</w:t>
+      </w:r>
+    </w:p>
+    <w:p>
+      <w:pPr>
+        <w:pStyle w:val="Heading3"/>
+        <w:ind w:left="567"/>
+      </w:pPr>
+      <w:r>
+        <w:t>5.2.</w:t>
+      </w:r>
+      <w:r>
+        <w:t>4</w:t>
+      </w:r>
+      <w:r>
+        <w:t xml:space="preserve"> Logistics vẫn còn dư địa để tối ưu</w:t>
+      </w:r>
+    </w:p>
+    <w:p>
+      <w:pPr>
+        <w:jc w:val="both"/>
+        <w:rPr>
+          <w:rFonts w:ascii="Times New Roman" w:hAnsi="Times New Roman" w:cs="Times New Roman"/>
+          <w:sz w:val="24"/>
+          <w:szCs w:val="24"/>
+        </w:rPr>
+      </w:pPr>
+      <w:r>
+        <w:rPr>
+          <w:rFonts w:ascii="Times New Roman" w:hAnsi="Times New Roman" w:cs="Times New Roman"/>
+          <w:sz w:val="24"/>
+          <w:szCs w:val="24"/>
+        </w:rPr>
+        <w:t>Tổng chi phí vận chuyển trong dữ liệu đạt khoảng 1,35 triệu USD, với chi phí trung bình khoảng 53,99 USD/đơn và thời gian giao hàng trung bình khoảng 4 ngày.</w:t>
+      </w:r>
+    </w:p>
+    <w:p>
+      <w:pPr>
+        <w:jc w:val="both"/>
+        <w:rPr>
+          <w:rFonts w:ascii="Times New Roman" w:hAnsi="Times New Roman" w:cs="Times New Roman"/>
+          <w:sz w:val="24"/>
+          <w:szCs w:val="24"/>
+        </w:rPr>
+      </w:pPr>
+      <w:r>
+        <w:rPr>
+          <w:rFonts w:ascii="Times New Roman" w:hAnsi="Times New Roman" w:cs="Times New Roman"/>
+          <w:sz w:val="24"/>
+          <w:szCs w:val="24"/>
+        </w:rPr>
+        <w:t>Phân tích đồng thời Ship Mode và Order Priority cho thấy vẫn tồn tại nhiều đơn hàng có mức ưu tiên Critical hoặc High nhưng được phân bổ vào Standard Class. Điều này đặt ra vấn đề về sự phù hợp giữa mức độ ưu tiên của đơn hàng và phương thức vận chuyển được lựa chọn.</w:t>
+      </w:r>
+    </w:p>
+    <w:p>
+      <w:pPr>
+        <w:jc w:val="both"/>
+        <w:rPr>
+          <w:rFonts w:ascii="Times New Roman" w:hAnsi="Times New Roman" w:cs="Times New Roman"/>
+          <w:sz w:val="24"/>
+          <w:szCs w:val="24"/>
+        </w:rPr>
+      </w:pPr>
+      <w:r>
+        <w:rPr>
+          <w:rFonts w:ascii="Times New Roman" w:hAnsi="Times New Roman" w:cs="Times New Roman"/>
+          <w:sz w:val="24"/>
+          <w:szCs w:val="24"/>
+        </w:rPr>
+        <w:t>Do đó, doanh nghiệp cần xây dựng cơ chế phân luồng vận chuyển phù hợp hơn thay vì chỉ tối ưu riêng về tốc độ hoặc chi phí.</w:t>
+      </w:r>
+    </w:p>
+    <w:p/>
+    <w:p>
+      <w:pPr>
+        <w:pStyle w:val="Heading2"/>
+      </w:pPr>
+      <w:r>
+        <w:lastRenderedPageBreak/>
+        <w:t>5</w:t>
+      </w:r>
+      <w:r>
+        <w:t>.</w:t>
+      </w:r>
+      <w:r>
+        <w:t>3</w:t>
+      </w:r>
+      <w:r>
+        <w:t xml:space="preserve"> </w:t>
+      </w:r>
+      <w:r>
+        <w:t>Đề xuất chiến lược</w:t>
+      </w:r>
+    </w:p>
+    <w:p>
+      <w:pPr>
+        <w:jc w:val="both"/>
+        <w:rPr>
+          <w:rFonts w:ascii="Times New Roman" w:hAnsi="Times New Roman" w:cs="Times New Roman"/>
+          <w:sz w:val="24"/>
+          <w:szCs w:val="24"/>
+        </w:rPr>
+      </w:pPr>
+      <w:r>
+        <w:rPr>
+          <w:rFonts w:ascii="Times New Roman" w:hAnsi="Times New Roman" w:cs="Times New Roman"/>
+          <w:sz w:val="24"/>
+          <w:szCs w:val="24"/>
+        </w:rPr>
+        <w:t>Từ các kết quả phân tích trên, nhóm đề xuất một số định hướng cải thiện hiệu quả hoạt động của Superstore.</w:t>
+      </w:r>
+    </w:p>
+    <w:p>
+      <w:pPr>
+        <w:jc w:val="both"/>
+        <w:rPr>
+          <w:rFonts w:ascii="Times New Roman" w:hAnsi="Times New Roman" w:cs="Times New Roman"/>
+          <w:sz w:val="24"/>
+          <w:szCs w:val="24"/>
+        </w:rPr>
+      </w:pPr>
+      <w:r>
+        <w:rPr>
+          <w:rFonts w:ascii="Times New Roman" w:hAnsi="Times New Roman" w:cs="Times New Roman"/>
+          <w:sz w:val="24"/>
+          <w:szCs w:val="24"/>
+        </w:rPr>
+        <w:t>Thứ nhất, kiểm soát chính sách chiết khấu. Doanh nghiệp nên xem mức 30% là một ngưỡng cần được giám sát đặc biệt dựa trên kết quả của bộ dữ liệu hiện tại. Những chương trình có mức giảm giá vượt ngưỡng này cần được đánh giá thêm về biên lợi nhuận sản phẩm trước khi triển khai.</w:t>
+      </w:r>
+    </w:p>
+    <w:p>
+      <w:pPr>
+        <w:jc w:val="both"/>
+        <w:rPr>
+          <w:rFonts w:ascii="Times New Roman" w:hAnsi="Times New Roman" w:cs="Times New Roman"/>
+          <w:sz w:val="24"/>
+          <w:szCs w:val="24"/>
+        </w:rPr>
+      </w:pPr>
+      <w:r>
+        <w:rPr>
+          <w:rFonts w:ascii="Times New Roman" w:hAnsi="Times New Roman" w:cs="Times New Roman"/>
+          <w:sz w:val="24"/>
+          <w:szCs w:val="24"/>
+        </w:rPr>
+        <w:t>Thứ hai, tái đánh giá danh mục sản phẩm. Đối với các nhóm đang có hiệu quả thấp như Tables, doanh nghiệp cần xem xét lại giá bán, mức chiết khấu, chi phí và chiến lược kinh doanh. Đồng thời, có thể ưu tiên các nhóm có khả năng sinh lời tốt như Technology để cải thiện cơ cấu lợi nhuận.</w:t>
+      </w:r>
+    </w:p>
+    <w:p>
+      <w:pPr>
+        <w:jc w:val="both"/>
+        <w:rPr>
+          <w:rFonts w:ascii="Times New Roman" w:hAnsi="Times New Roman" w:cs="Times New Roman"/>
+          <w:sz w:val="24"/>
+          <w:szCs w:val="24"/>
+        </w:rPr>
+      </w:pPr>
+      <w:r>
+        <w:rPr>
+          <w:rFonts w:ascii="Times New Roman" w:hAnsi="Times New Roman" w:cs="Times New Roman"/>
+          <w:sz w:val="24"/>
+          <w:szCs w:val="24"/>
+        </w:rPr>
+        <w:t>Thứ ba, xây dựng chiến lược chăm sóc khách hàng dựa trên RFM. Nhóm Champions cần được duy trì bằng các chương trình khách hàng thân thiết và ưu đãi phù hợp. Đối với Can't Lose Them và Churn High Spending, doanh nghiệp nên triển khai các chương trình tái kích hoạt, ưu đãi cá nhân hóa hoặc chăm sóc trực tiếp nhằm tăng khả năng khách hàng quay lại mua hàng.</w:t>
+      </w:r>
+    </w:p>
+    <w:p>
+      <w:pPr>
+        <w:jc w:val="both"/>
+        <w:rPr>
+          <w:rFonts w:ascii="Times New Roman" w:hAnsi="Times New Roman" w:cs="Times New Roman"/>
+          <w:sz w:val="24"/>
+          <w:szCs w:val="24"/>
+        </w:rPr>
+      </w:pPr>
+      <w:r>
+        <w:rPr>
+          <w:rFonts w:ascii="Times New Roman" w:hAnsi="Times New Roman" w:cs="Times New Roman"/>
+          <w:sz w:val="24"/>
+          <w:szCs w:val="24"/>
+        </w:rPr>
+        <w:t>Thứ tư, tối ưu hoạt động logistics. Doanh nghiệp nên xây dựng quy tắc lựa chọn Ship Mode dựa trên Order Priority. Các đơn hàng Critical và High cần được đánh giá để lựa chọn phương thức vận chuyển phù hợp hơn, đồng thời vẫn phải cân đối với chi phí phát sinh.</w:t>
+      </w:r>
+    </w:p>
+    <w:p>
+      <w:pPr>
+        <w:jc w:val="both"/>
+        <w:rPr>
+          <w:rFonts w:ascii="Times New Roman" w:hAnsi="Times New Roman" w:cs="Times New Roman"/>
+          <w:sz w:val="24"/>
+          <w:szCs w:val="24"/>
+        </w:rPr>
+      </w:pPr>
+      <w:r>
+        <w:rPr>
+          <w:rFonts w:ascii="Times New Roman" w:hAnsi="Times New Roman" w:cs="Times New Roman"/>
+          <w:sz w:val="24"/>
+          <w:szCs w:val="24"/>
+        </w:rPr>
+        <w:t>Thứ năm, nghiên cứu các thị trường có hiệu quả cao. Canada ghi nhận biên lợi nhuận khoảng 26,62%, cao hơn đáng kể so với một số thị trường khác như EMEA. Doanh nghiệp có thể phân tích sâu hơn về cơ cấu sản phẩm, chính sách giá, chiết khấu và logistics tại Canada để xác định những yếu tố có khả năng áp dụng cho các thị trường có hiệu quả thấp hơn.</w:t>
+      </w:r>
+    </w:p>
+    <w:p/>
+    <w:p>
+      <w:pPr>
+        <w:pStyle w:val="Heading2"/>
+        <w:rPr>
+          <w:bCs/>
+        </w:rPr>
+      </w:pPr>
+      <w:r>
+        <w:t>5</w:t>
+      </w:r>
+      <w:r>
+        <w:t>.</w:t>
+      </w:r>
+      <w:r>
+        <w:t>4</w:t>
+      </w:r>
+      <w:r>
+        <w:t xml:space="preserve"> </w:t>
+      </w:r>
+      <w:r>
+        <w:rPr>
+          <w:bCs/>
+        </w:rPr>
+        <w:t>Hạn chế của dự án</w:t>
+      </w:r>
+    </w:p>
+    <w:p>
+      <w:pPr>
+        <w:jc w:val="both"/>
+        <w:rPr>
+          <w:rFonts w:ascii="Times New Roman" w:hAnsi="Times New Roman" w:cs="Times New Roman"/>
+          <w:sz w:val="24"/>
+          <w:szCs w:val="24"/>
+        </w:rPr>
+      </w:pPr>
+      <w:r>
+        <w:rPr>
+          <w:rFonts w:ascii="Times New Roman" w:hAnsi="Times New Roman" w:cs="Times New Roman"/>
+          <w:sz w:val="24"/>
+          <w:szCs w:val="24"/>
+        </w:rPr>
+        <w:t>Mặc dù dự án đã đạt được các mục tiêu chính, kết quả phân tích vẫn tồn tại một số giới hạn.</w:t>
+      </w:r>
+    </w:p>
+    <w:p>
+      <w:pPr>
+        <w:jc w:val="both"/>
+        <w:rPr>
+          <w:rFonts w:ascii="Times New Roman" w:hAnsi="Times New Roman" w:cs="Times New Roman"/>
+          <w:sz w:val="24"/>
+          <w:szCs w:val="24"/>
+        </w:rPr>
+      </w:pPr>
+      <w:r>
+        <w:rPr>
+          <w:rFonts w:ascii="Times New Roman" w:hAnsi="Times New Roman" w:cs="Times New Roman"/>
+          <w:sz w:val="24"/>
+          <w:szCs w:val="24"/>
+        </w:rPr>
+        <w:t>Thứ nhất, dữ liệu sử dụng trong dự án là dữ liệu lịch sử, do đó các kết quả chủ yếu phản ánh những xu hướng và mối quan hệ đã xảy ra trong quá khứ.</w:t>
+      </w:r>
+    </w:p>
+    <w:p>
+      <w:pPr>
+        <w:jc w:val="both"/>
+        <w:rPr>
+          <w:rFonts w:ascii="Times New Roman" w:hAnsi="Times New Roman" w:cs="Times New Roman"/>
+          <w:sz w:val="24"/>
+          <w:szCs w:val="24"/>
+        </w:rPr>
+      </w:pPr>
+      <w:r>
+        <w:rPr>
+          <w:rFonts w:ascii="Times New Roman" w:hAnsi="Times New Roman" w:cs="Times New Roman"/>
+          <w:sz w:val="24"/>
+          <w:szCs w:val="24"/>
+        </w:rPr>
+        <w:t>Thứ hai, một số đề xuất như giới hạn mức chiết khấu, thay đổi phương thức vận chuyển hay áp dụng mô hình của thị trường có hiệu quả cao mới được xây dựng dưới dạng kịch bản và định hướng chiến lược. Dự án hiện chưa đủ cơ sở để khẳng định chính xác mức tăng doanh thu hoặc lợi nhuận sẽ đạt được sau khi áp dụng các giải pháp này.</w:t>
+      </w:r>
+    </w:p>
+    <w:p>
+      <w:pPr>
+        <w:jc w:val="both"/>
+        <w:rPr>
+          <w:rFonts w:ascii="Times New Roman" w:hAnsi="Times New Roman" w:cs="Times New Roman"/>
+          <w:sz w:val="24"/>
+          <w:szCs w:val="24"/>
+        </w:rPr>
+      </w:pPr>
+      <w:r>
+        <w:rPr>
+          <w:rFonts w:ascii="Times New Roman" w:hAnsi="Times New Roman" w:cs="Times New Roman"/>
+          <w:sz w:val="24"/>
+          <w:szCs w:val="24"/>
+        </w:rPr>
+        <w:t>Thứ ba, dự án chưa tích hợp các yếu tố bên ngoài như biến động kinh tế, đối thủ cạnh tranh, chi phí tồn kho, hành vi người tiêu dùng hoặc các chiến dịch marketing thực tế. Đây đều là những yếu tố có thể ảnh hưởng đến kết quả kinh doanh.</w:t>
+      </w:r>
+    </w:p>
+    <w:p>
+      <w:pPr>
+        <w:pStyle w:val="Heading2"/>
+        <w:rPr>
+          <w:bCs/>
+        </w:rPr>
+      </w:pPr>
+      <w:r>
+        <w:lastRenderedPageBreak/>
+        <w:t>5</w:t>
+      </w:r>
+      <w:r>
+        <w:t>.</w:t>
+      </w:r>
+      <w:r>
+        <w:t>5</w:t>
+      </w:r>
+      <w:r>
+        <w:t xml:space="preserve"> </w:t>
+      </w:r>
+      <w:r>
+        <w:rPr>
+          <w:bCs/>
+        </w:rPr>
+        <w:t>Hướng phát triển</w:t>
+      </w:r>
+    </w:p>
+    <w:p>
+      <w:pPr>
+        <w:jc w:val="both"/>
+        <w:rPr>
+          <w:rFonts w:ascii="Times New Roman" w:hAnsi="Times New Roman" w:cs="Times New Roman"/>
+          <w:sz w:val="24"/>
+          <w:szCs w:val="24"/>
+        </w:rPr>
+      </w:pPr>
+      <w:r>
+        <w:rPr>
+          <w:rFonts w:ascii="Times New Roman" w:hAnsi="Times New Roman" w:cs="Times New Roman"/>
+          <w:sz w:val="24"/>
+          <w:szCs w:val="24"/>
+        </w:rPr>
+        <w:t>Trong tương lai, hệ thống có thể được mở rộng theo hướng Predictive Analytics thay vì chỉ tập trung vào Descriptive Analytics.</w:t>
+      </w:r>
+    </w:p>
+    <w:p>
+      <w:pPr>
+        <w:jc w:val="both"/>
+        <w:rPr>
+          <w:rFonts w:ascii="Times New Roman" w:hAnsi="Times New Roman" w:cs="Times New Roman"/>
+          <w:sz w:val="24"/>
+          <w:szCs w:val="24"/>
+        </w:rPr>
+      </w:pPr>
+      <w:r>
+        <w:rPr>
+          <w:rFonts w:ascii="Times New Roman" w:hAnsi="Times New Roman" w:cs="Times New Roman"/>
+          <w:sz w:val="24"/>
+          <w:szCs w:val="24"/>
+        </w:rPr>
+        <w:t>Nhóm có thể xây dựng các mô hình dự báo doanh thu và lợi nhuận theo tháng hoặc quý; mô hình dự đoán khả năng khách hàng rời bỏ; phân tích Customer Lifetime Value; dự báo nhu cầu sản phẩm và xây dựng mô hình tối ưu mức chiết khấu.</w:t>
+      </w:r>
+    </w:p>
+    <w:p>
+      <w:pPr>
+        <w:jc w:val="both"/>
+        <w:rPr>
+          <w:rFonts w:ascii="Times New Roman" w:hAnsi="Times New Roman" w:cs="Times New Roman"/>
+          <w:sz w:val="24"/>
+          <w:szCs w:val="24"/>
+        </w:rPr>
+      </w:pPr>
+      <w:r>
+        <w:rPr>
+          <w:rFonts w:ascii="Times New Roman" w:hAnsi="Times New Roman" w:cs="Times New Roman"/>
+          <w:sz w:val="24"/>
+          <w:szCs w:val="24"/>
+        </w:rPr>
+        <w:t>Bên cạnh đó, quy trình ETL và Dashboard có thể được tự động hóa để dữ liệu mới được cập nhật định kỳ, giúp nhà quản lý theo dõi các KPI và phát hiện những biến động bất thường trong hoạt động kinh doanh nhanh hơn.</w:t>
+      </w:r>
+    </w:p>
+    <w:p>
+      <w:pPr>
+        <w:pStyle w:val="Heading2"/>
+        <w:rPr>
+          <w:bCs/>
+        </w:rPr>
+      </w:pPr>
+      <w:r>
+        <w:t>5</w:t>
+      </w:r>
+      <w:r>
+        <w:t>.</w:t>
+      </w:r>
+      <w:r>
+        <w:t>6</w:t>
+      </w:r>
+      <w:r>
+        <w:t xml:space="preserve"> </w:t>
+      </w:r>
+      <w:r>
+        <w:rPr>
+          <w:bCs/>
+        </w:rPr>
+        <w:t>Tổng kết</w:t>
+      </w:r>
+    </w:p>
+    <w:p>
+      <w:pPr>
+        <w:jc w:val="both"/>
+        <w:rPr>
+          <w:rFonts w:ascii="Times New Roman" w:hAnsi="Times New Roman" w:cs="Times New Roman"/>
+          <w:sz w:val="24"/>
+          <w:szCs w:val="24"/>
+        </w:rPr>
+      </w:pPr>
+      <w:r>
+        <w:rPr>
+          <w:rFonts w:ascii="Times New Roman" w:hAnsi="Times New Roman" w:cs="Times New Roman"/>
+          <w:sz w:val="24"/>
+          <w:szCs w:val="24"/>
+        </w:rPr>
+        <w:t>Nhìn chung, kết quả của dự án cho thấy tăng trưởng doanh thu chưa đồng nghĩa với tăng trưởng hiệu quả kinh doanh. Đối với Superstore, vấn đề quan trọng không chỉ nằm ở việc bán được nhiều hàng hơn mà còn ở khả năng kiểm soát chiết khấu, lựa chọn danh mục sản phẩm phù hợp, duy trì khách hàng có giá trị và tối ưu chi phí vận hành.</w:t>
+      </w:r>
+    </w:p>
+    <w:p>
+      <w:pPr>
+        <w:jc w:val="both"/>
+        <w:rPr>
+          <w:rFonts w:ascii="Times New Roman" w:hAnsi="Times New Roman" w:cs="Times New Roman"/>
+          <w:sz w:val="24"/>
+          <w:szCs w:val="24"/>
+        </w:rPr>
+      </w:pPr>
+      <w:r>
+        <w:rPr>
+          <w:rFonts w:ascii="Times New Roman" w:hAnsi="Times New Roman" w:cs="Times New Roman"/>
+          <w:sz w:val="24"/>
+          <w:szCs w:val="24"/>
+        </w:rPr>
+        <w:t>Thông qua việc chuyển đổi dữ liệu giao dịch thành các chỉ số, mô hình phân tích và Dashboard trực quan, dự án đã giúp làm rõ những yếu tố đang tác động đến hiệu quả kinh doanh của doanh nghiệp và cung cấp cơ sở dữ liệu hỗ trợ cho quá trình ra quyết định.</w:t>
+      </w:r>
+    </w:p>
+    <w:p>
+      <w:pPr>
+        <w:jc w:val="both"/>
+        <w:rPr>
+          <w:rFonts w:ascii="Times New Roman" w:hAnsi="Times New Roman" w:cs="Times New Roman"/>
+          <w:sz w:val="24"/>
+          <w:szCs w:val="24"/>
+        </w:rPr>
+      </w:pPr>
+      <w:r>
+        <w:rPr>
+          <w:rFonts w:ascii="Times New Roman" w:hAnsi="Times New Roman" w:cs="Times New Roman"/>
+          <w:sz w:val="24"/>
+          <w:szCs w:val="24"/>
+        </w:rPr>
+        <w:t>Giá trị cốt lõi mà dự án hướng đến không phải chỉ là trả lời câu hỏi “Doanh nghiệp bán được bao nhiêu?”, mà quan trọng hơn là trả lời được “Doanh nghiệp đang thực sự kiếm được bao nhiêu, lợi nhuận đang thất thoát ở đâu và cần hành động như thế nào để cải thiện hiệu quả kinh doanh?”.</w:t>
+      </w:r>
+    </w:p>
+    <w:p>
+      <w:pPr>
+        <w:jc w:val="both"/>
+        <w:rPr>
+          <w:rFonts w:ascii="Times New Roman" w:hAnsi="Times New Roman" w:cs="Times New Roman"/>
+          <w:sz w:val="24"/>
+          <w:szCs w:val="24"/>
+        </w:rPr>
+      </w:pPr>
+      <w:r>
+        <w:rPr>
+          <w:rFonts w:ascii="Times New Roman" w:hAnsi="Times New Roman" w:cs="Times New Roman"/>
+          <w:sz w:val="24"/>
+          <w:szCs w:val="24"/>
+        </w:rPr>
+        <w:t>Đây cũng chính là giá trị của việc ứng dụng phân tích dữ liệu trong hoạt động quản trị doanh nghiệp: biến dữ liệu thô thành thông tin, biến thông tin thành insight và biến insight thành cơ sở cho hành động.</w:t>
+      </w:r>
+    </w:p>
+    <w:p/>
+    <w:p>
+      <w:pPr>
+        <w:jc w:val="both"/>
+        <w:rPr>
+          <w:rFonts w:ascii="Times New Roman" w:hAnsi="Times New Roman" w:cs="Times New Roman"/>
+          <w:sz w:val="24"/>
+          <w:szCs w:val="24"/>
+        </w:rPr>
+      </w:pPr>
+    </w:p>
+    <w:p/>
+    <w:p/>
+    <w:p/>
+    <w:p>
+      <w:pPr>
+        <w:jc w:val="both"/>
+        <w:rPr>
+          <w:rFonts w:ascii="Times New Roman" w:hAnsi="Times New Roman" w:cs="Times New Roman"/>
+          <w:sz w:val="24"/>
+          <w:szCs w:val="24"/>
+        </w:rPr>
+      </w:pPr>
+    </w:p>
+    <w:p/>
+    <w:p>
+      <w:pPr>
+        <w:jc w:val="both"/>
+        <w:rPr>
+          <w:rFonts w:ascii="Times New Roman" w:hAnsi="Times New Roman" w:cs="Times New Roman"/>
+          <w:sz w:val="24"/>
+          <w:szCs w:val="24"/>
+        </w:rPr>
+      </w:pPr>
+    </w:p>
+    <w:p/>
+    <w:p/>
+    <w:p/>
+    <w:p/>
+    <w:p/>
     <w:p>
       <w:pPr>
         <w:rPr>

</xml_diff>